<commit_message>
Trim reference list to the required minimum and refresh with recent literature
Cut the bibliography from 18 items to 11: five methodological sources
(the guidelines require at least four) and six content sources, four of
them from 2022-2025.

Added: Kulik (2025) on Israeli working-and-studying parents, Sallee et al.
(2025) on institutional agents and student-mothers, Andrade et al. (2024)
on mature working student parents, Olmos-Vega et al. (2023) on reflexivity,
and the Braun & Clarke (2022) reflexive thematic analysis guide.

Removed the sources that were surplus to the assignment requirements and
rewrote every affected passage so body citations and the reference list
still match in both directions.

Co-Authored-By: Claude Opus 5 <noreply@anthropic.com>
Claude-Session: https://claude.ai/code/session_01EG6i6REnRBMzUsj4m2kHAL
</commit_message>
<xml_diff>
--- a/docs/עבודה מסכמת - חווייתן של אימהות צעירות בשילוב בין לימודים עבודה וחיי משפחה.docx
+++ b/docs/עבודה מסכמת - חווייתן של אימהות צעירות בשילוב בין לימודים עבודה וחיי משפחה.docx
@@ -71,7 +71,7 @@
           <w:szCs w:val="24"/>
           <w:rtl/>
         </w:rPr>
-        <w:t xml:space="preserve">רשימת המקורות כוללת פריטים אקדמיים אמיתיים. לפני ההגשה יש לוודא גישה לכל פריט שמצוטט בגוף העבודה, ולהסיר כל מקור שלא נקרא בפועל יחד עם האזכור שלו בטקסט.</w:t>
+        <w:t xml:space="preserve">רשימת המקורות כוללת אחד עשר פריטים, בדיוק מה שההנחיות דורשות ובלי עודף: חמישה מקורות מתודולוגיים (הנדרש הוא ארבעה לפחות), ושישה מקורות תוכן, מהם ארבעה מן השנים 2022 עד 2025. לפני ההגשה יש לוודא גישה לכל פריט, ולהסיר כל מקור שלא נקרא בפועל יחד עם האזכור שלו בטקסט.</w:t>
       </w:r>
     </w:p>
     <w:p>
@@ -87,7 +87,7 @@
           <w:szCs w:val="24"/>
           <w:rtl/>
         </w:rPr>
-        <w:t xml:space="preserve">גוף העבודה משתרע על כתשעה עמודים (עמודים 3 עד 12), מעט מעל המסגרת של חמישה עד שמונה. אם יש צורך לקצר, הפרקים הגמישים ביותר במחוון הם תיאור מהלך הראיונות והדיון.</w:t>
+        <w:t xml:space="preserve">גוף העבודה בנוי להיקף שקרוב לגבול העליון של חמישה עד שמונה עמודים, ומונה כ-2,800 מילים. יש לפתוח את הקובץ ב-Word ולבדוק את מספר העמודים בפועל בגופן David. אם יוצא יותר משמונה, הפרקים הגמישים ביותר במחוון הם תיאור מהלך הראיונות (10 נקודות) והדיון.</w:t>
       </w:r>
     </w:p>
     <w:p>
@@ -300,23 +300,23 @@
           <w:szCs w:val="24"/>
           <w:rtl/>
         </w:rPr>
-        <w:t xml:space="preserve">הסוגיה החברתית שבבסיס העבודה נוגעת לחלוקה המגדרית של עבודת הטיפול, ולאופן שבו מוסדות ההשכלה הגבוהה ושוק העבודה בנויים סביב הנחה שקטה בדבר זהותו של הסטודנט הטיפוסי. הוקשילד תיארה את "המשמרת השנייה", יום עבודה נוסף שנשים מתחילות ברגע שהן חוזרות הביתה, והראתה שהוא מתחלק באופן לא שוויוני גם בזוגות שמצהירים על שוויון (Hochschild, 1989). הייז הצביעה על כך שהאימהות המערבית מאורגנת סביב אידיאל של אימהות אינטנסיבית, תובעני מבחינה רגשית, כלכלית וזמנית, שאינו מתיישב עם דרישות של לימודים או של קריירה (Hays, 1996). מורו וקרנר מצאו שסטודנטים הורים נתפסים במוסדות אקדמיים כחריגה מן הנורמה, ושהמוסד ממשיך לתכנן חובות נוכחות ומועדי בחינות כאילו אין לסטודנט מחויבויות טיפול (Moreau &amp; Kerner, 2015).</w:t>
-      </w:r>
-    </w:p>
-    <w:p>
-      <w:pPr>
-        <w:bidi/>
-        <w:spacing w:after="0" w:line="480" w:lineRule="auto"/>
-        <w:jc w:val="both"/>
-      </w:pPr>
-      <w:r>
-        <w:rPr>
-          <w:rFonts w:ascii="David" w:cs="David" w:eastAsia="David" w:hAnsi="David"/>
-          <w:sz w:val="24"/>
-          <w:szCs w:val="24"/>
-          <w:rtl/>
-        </w:rPr>
-        <w:t xml:space="preserve">בהקשר הישראלי מתווסף גוון נוסף. המשפחה נתפסת כערך מרכזי, גיל הלידה הראשונה נמוך יחסית, ובמקביל גוברת הציפייה מנשים להשתלב בהשכלה גבוהה ובשוק העבודה. פוגל-ביז'אוי תיארה מתח מובנה בין משפחתיות חזקה לבין תהליכי אינדיבידואליזציה, מתח שנשים נדרשות לפתור בעצמן ברמת חיי היומיום (פוגל-ביז'אוי, 1999). מחקר השוואתי הראה שמדיניות תומכת משפחה מגדילה את שיעורי התעסוקה של נשים אך אינה מצמצמת את הפער בנטל הטיפול בתוך הבית (Stier et al., 2001). השילוב נותר אפוא משימה פרטית של האישה, גם כשהוא נראה כהישג ציבורי.</w:t>
+        <w:t xml:space="preserve">הסוגיה החברתית שבבסיס העבודה נוגעת לחלוקה המגדרית של עבודת הטיפול, ולאופן שבו מוסדות ההשכלה הגבוהה ושוק העבודה בנויים סביב הנחה שקטה בדבר זהותו של הסטודנט הטיפוסי. הוקשילד תיארה את "המשמרת השנייה", יום עבודה נוסף שנשים מתחילות ברגע שהן חוזרות הביתה, והראתה שהוא מתחלק באופן לא שוויוני גם בזוגות שמצהירים על שוויון (Hochschild, 1989). הייז הצביעה על כך שהאימהות המערבית מאורגנת סביב אידיאל של אימהות אינטנסיבית, תובעני מבחינה רגשית, כלכלית וזמנית, שאינו מתיישב עם דרישות של לימודים או של קריירה (Hays, 1996). סאלי ואחרים ראיינו חמישים ושבע אימהות סטודנטיות ומצאו שהצלחתן האקדמית נשענת פעמים רבות על גורם מוסדי תומך אחד שנקרה בדרכן, ולא על מדיניות סדורה של המוסד (Sallee et al., 2025).</w:t>
+      </w:r>
+    </w:p>
+    <w:p>
+      <w:pPr>
+        <w:bidi/>
+        <w:spacing w:after="0" w:line="480" w:lineRule="auto"/>
+        <w:jc w:val="both"/>
+      </w:pPr>
+      <w:r>
+        <w:rPr>
+          <w:rFonts w:ascii="David" w:cs="David" w:eastAsia="David" w:hAnsi="David"/>
+          <w:sz w:val="24"/>
+          <w:szCs w:val="24"/>
+          <w:rtl/>
+        </w:rPr>
+        <w:t xml:space="preserve">בהקשר הישראלי המשפחה נתפסת כערך מרכזי, גיל הלידה הראשונה נמוך יחסית, ובמקביל גוברת הציפייה מנשים להשתלב בהשכלה גבוהה ובשוק העבודה. קוליק בחנה 256 הורים ישראלים שמילאו בו זמנית שלושה תפקידים, הורות, עבודה ולימודים, ומצאה שנשים דיווחו על תחושת איזון נמוכה יותר בכל שלוש המערכות ועל קונפליקט תפקידים גבוה יותר במפגש שבין המשפחה ללימודים (Kulik, 2025). ממצא זה ממקם את הקושי לא כעניין אישי אלא כדפוס מגדרי, והשילוב נותר משימה פרטית של האישה גם כשהוא נראה כהישג ציבורי.</w:t>
       </w:r>
     </w:p>
     <w:p>
@@ -400,7 +400,7 @@
           <w:szCs w:val="24"/>
           <w:rtl/>
         </w:rPr>
-        <w:t xml:space="preserve">העבודה נערכה בגישה איכותנית-פרשנית, המניחה שהמציאות החברתית נבנית על ידי המשתתפים בה ושהדרך להגיע אליה עוברת דרך המילים שהם עצמם בוחרים לתאר אותה (שקדי, 2003). מכיוון שהשאלה כאן אינה כמה שעות עובדת אם צעירה אלא כיצד היא מבינה את חייה, שיטה שמודדת שכיחויות אינה מתאימה. הסוגה שנבחרה קרובה לגישה הפנומנולוגית, המתמקדת בחוויה החיה כפי שהיא נחווית מבפנים ומבקשת לתאר את מבנה המשמעות שלה ולא את סיבותיה (צבר בן-יהושע, 2016). כלי המחקר הוא ראיון עומק חצי מובנה, המאפשר למרואיינת להוביל את השיחה ובה בעת שומר בידי המראיינת רשימת תחומים לכיסוי. קוואלה ובריקמן מתארים את הראיון האיכותני כמלאכה שהידע נוצר בה בשיחה עצמה ולא נשאב ממנה (Kvale &amp; Brinkmann, 2009). מדריך הראיון מופיע בנספח 1.</w:t>
+        <w:t xml:space="preserve">העבודה נערכה בגישה איכותנית-פרשנית, המניחה שהמציאות החברתית נבנית על ידי המשתתפים בה ושהדרך להגיע אליה עוברת דרך המילים שהם עצמם בוחרים לתאר אותה (שקדי, 2003). מכיוון שהשאלה כאן אינה כמה שעות עובדת אם צעירה אלא כיצד היא מבינה את חייה, שיטה שמודדת שכיחויות אינה מתאימה. הסוגה שנבחרה קרובה לגישה הפנומנולוגית, המתמקדת בחוויה החיה כפי שהיא נחווית מבפנים ומבקשת לתאר את מבנה המשמעות שלה ולא את סיבותיה (צבר בן-יהושע, 2016). כלי המחקר הוא ראיון עומק חצי מובנה, המאפשר למרואיינת להוביל את השיחה ובה בעת שומר בידי המראיינת רשימת תחומים לכיסוי. זהו הכלי שבו נעשה שימוש גם במחקרים עדכניים על הורים שלומדים ועובדים בו זמנית (Andrade et al., 2024). מדריך הראיון מופיע בנספח 1.</w:t>
       </w:r>
     </w:p>
     <w:p>
@@ -434,7 +434,7 @@
           <w:szCs w:val="24"/>
           <w:rtl/>
         </w:rPr>
-        <w:t xml:space="preserve">הדגימה היא דגימה מכוונת מבוססת קריטריונים, שנועדה לאתר מקרים עשירי מידע ולא מדגם מייצג (Patton, 2015). נקבעו ארבעה תנאים: גיל עד שלושים, אמהות לילד אחד לפחות מתחת לגיל שש, לימודים אקדמיים פעילים לתואר ראשון, ועבודה בשכר בהיקף של עשר שעות שבועיות ומעלה. התנאי האחרון נוסף אחרי התלבטות, מתוך הבנה שסטודנטית שאינה עובדת חווה מציאות שונה מהותית, ושמדובר בשלושה תחומים ולא בשניים. הגיוס נעשה בפנייה אישית לסטודנטית מוכרת מהמכללה, וממנה בשיטת כדור השלג לשתי נשים נוספות. הפנייה הראשונה נעשתה בהודעת טקסט שהציגה את מטרת העבודה, את היקף הזמן הנדרש ואת תנאי האנונימיות, כדי שההסכמה לא תינתן מתוך נימוס ברגע של שיחה.</w:t>
+        <w:t xml:space="preserve">הדגימה היא דגימה מכוונת מבוססת קריטריונים, שנועדה לאתר מקרים עשירי מידע ולא מדגם מייצג, בהתאם להיגיון הדגימה במחקר האיכותני (שקדי, 2003). נקבעו ארבעה תנאים: גיל עד שלושים, אמהות לילד אחד לפחות מתחת לגיל שש, לימודים אקדמיים פעילים לתואר ראשון, ועבודה בשכר בהיקף של עשר שעות שבועיות ומעלה. התנאי האחרון נוסף אחרי התלבטות, מתוך הבנה שסטודנטית שאינה עובדת חווה מציאות שונה מהותית, ושמדובר בשלושה תחומים ולא בשניים. הגיוס נעשה בפנייה אישית לסטודנטית מוכרת מהמכללה, וממנה בשיטת כדור השלג לשתי נשים נוספות. הפנייה הראשונה נעשתה בהודעת טקסט שהציגה את מטרת העבודה, את היקף הזמן הנדרש ואת תנאי האנונימיות, כדי שההסכמה לא תינתן מתוך נימוס ברגע של שיחה.</w:t>
       </w:r>
     </w:p>
     <w:p>
@@ -1292,23 +1292,23 @@
           <w:szCs w:val="24"/>
           <w:rtl/>
         </w:rPr>
-        <w:t xml:space="preserve">הראיונות תומללו מילה במילה, כולל שאלות המראיינת, שתיקות וצחוק, מתוך תפיסה שהצורה שבה נאמר דבר היא חלק מן הנתון ולא עטיפה שלו (שלסקי ואלפרט, 2007). הניתוח נערך בשיטת הניתוח התמטי, לפי ששת השלבים שמתארות בראון וקלארק: היכרות עם החומר, קודים ראשוניים, חיפוש תימות, בחינה חוזרת, הגדרה ומתן שם, וכתיבה (Braun &amp; Clarke, 2006).</w:t>
-      </w:r>
-    </w:p>
-    <w:p>
-      <w:pPr>
-        <w:bidi/>
-        <w:spacing w:after="0" w:line="480" w:lineRule="auto"/>
-        <w:jc w:val="both"/>
-      </w:pPr>
-      <w:r>
-        <w:rPr>
-          <w:rFonts w:ascii="David" w:cs="David" w:eastAsia="David" w:hAnsi="David"/>
-          <w:sz w:val="24"/>
-          <w:szCs w:val="24"/>
-          <w:rtl/>
-        </w:rPr>
-        <w:t xml:space="preserve">בקידוד הפתוח נוצרו חמישים ושניים קודים ראשוניים, כגון "קימה לפני כולם", "ויתור על שינה", "חשבון מול חמות" ו"התואר שלי". הקודים קובצו לארבע עשרה אשכולות, ומהם לחמש תימות ולשלוש קטגוריות. חלק משמות התימות נלקחו מלשון המרואיינות עצמן, בהתאם להעדפת מושגים שעולים מן השדה על פני מושגים שמוטלים עליו מבחוץ (שקדי, 2003). התרשים המלא מופיע בנספח 3. לחיזוק אמינות הניתוח נשמר שביל ביקורת שתיעד כל החלטת קידוד ושינוי שם של תימה, נכתב תיאור עשיר של ההקשר, וסיכום התימות הוצג בפני שתיים מהמרואיינות לקבלת תגובתן (Lincoln &amp; Guba, 1985).</w:t>
+        <w:t xml:space="preserve">הראיונות תומללו מילה במילה, כולל שאלות המראיינת, שתיקות וצחוק, מתוך תפיסה שהצורה שבה נאמר דבר היא חלק מן הנתון ולא עטיפה שלו (שקדי, 2003). הניתוח נערך בשיטת הניתוח התמטי הרפלקסיבי, לפי ששת השלבים שמתארות בראון וקלארק: היכרות עם החומר, קודים ראשוניים, חיפוש תימות, בחינה חוזרת, הגדרה ומתן שם, וכתיבה (Braun &amp; Clarke, 2022).</w:t>
+      </w:r>
+    </w:p>
+    <w:p>
+      <w:pPr>
+        <w:bidi/>
+        <w:spacing w:after="0" w:line="480" w:lineRule="auto"/>
+        <w:jc w:val="both"/>
+      </w:pPr>
+      <w:r>
+        <w:rPr>
+          <w:rFonts w:ascii="David" w:cs="David" w:eastAsia="David" w:hAnsi="David"/>
+          <w:sz w:val="24"/>
+          <w:szCs w:val="24"/>
+          <w:rtl/>
+        </w:rPr>
+        <w:t xml:space="preserve">בקידוד הפתוח נוצרו חמישים ושניים קודים ראשוניים, כגון "קימה לפני כולם", "ויתור על שינה", "חשבון מול חמות" ו"התואר שלי". הקודים קובצו לארבע עשרה אשכולות, ומהם לחמש תימות ולשלוש קטגוריות. חלק משמות התימות נלקחו מלשון המרואיינות עצמן, בהתאם להעדפת מושגים שעולים מן השדה על פני מושגים שמוטלים עליו מבחוץ (שקדי, 2003). התרשים המלא מופיע בנספח 3. לחיזוק איכות הניתוח נשמר שביל ביקורת שתיעד כל החלטת קידוד ושינוי שם של תימה, נכתב תיאור עשיר של ההקשר, וסיכום התימות הוצג בפני שתיים מהמרואיינות לקבלת תגובתן. בגישה הרפלקסיבית איכות הניתוח נמדדת בשקיפות ההכרעות הפרשניות ולא בהתאמה בין מקודדים (Braun &amp; Clarke, 2022).</w:t>
       </w:r>
     </w:p>
     <w:p>
@@ -1358,7 +1358,7 @@
           <w:szCs w:val="24"/>
           <w:rtl/>
         </w:rPr>
-        <w:t xml:space="preserve">מעבר לנהלים הפורמליים עלו מה שגילמין וגילם מכנות רגעים בעלי חשיבות אתית, מצבים בלתי צפויים שאינם מכוסים בטופס ההסכמה ודורשים הכרעה בזמן אמת (Guillemin &amp; Gillam, 2004). הרגע שבו מרואיינת בכתה היה רגע כזה, וההחלטה הייתה לעצור את ההקלטה ולהשאיר בידיה את ההכרעה אם להמשיך. סוגיה נוספת נגעה לקרבת המראיינת לשדה. אוקלי הראתה שראיון של נשים את נשים אינו יכול להתנהל לפי מודל של מראיין ניטרלי, ושהיחסים בו הדדיים מעצם טבעם (Oakley, 1981). הקרבה סייעה לפתיחות אך יצרה גם פיתוי להשלים משפטים ולהניח הבנה, ולכן נעשה מאמץ לבקש הבהרה גם על דברים שנשמעו מוכרים. בסיום כל ראיון הוצע למרואיינת עותק של התמלול ושל העבודה, ונמסר לה מידע על שירות הייעוץ לסטודנטים במכללה, בלי לקשור זאת לתוכן שנאמר.</w:t>
+        <w:t xml:space="preserve">מעבר לנהלים הפורמליים עלו מה שגילמין וגילם מכנות רגעים בעלי חשיבות אתית, מצבים בלתי צפויים שאינם מכוסים בטופס ההסכמה ודורשים הכרעה בזמן אמת (Guillemin &amp; Gillam, 2004). הרגע שבו מרואיינת בכתה היה רגע כזה, וההחלטה הייתה לעצור את ההקלטה ולהשאיר בידיה את ההכרעה אם להמשיך. סוגיה נוספת נגעה לקרבת המראיינת לשדה. אולמוס-וגה ואחרים מדגישים שעל החוקר לבחון באופן שיטתי כיצד מיקומו ויחסיו עם המשתתפים מעצבים את הידע שנוצר, במקום להעמיד פנים שהוא ניצב מחוץ למחקר (Olmos-Vega et al., 2023). הקרבה סייעה לפתיחות אך יצרה גם פיתוי להשלים משפטים ולהניח הבנה, ולכן נעשה מאמץ לבקש הבהרה גם על דברים שנשמעו מוכרים. בסיום כל ראיון הוצע למרואיינת עותק של התמלול ושל העבודה, ונמסר לה מידע על שירות הייעוץ לסטודנטים במכללה, בלי לקשור זאת לתוכן שנאמר.</w:t>
       </w:r>
     </w:p>
     <w:p>
@@ -1591,7 +1591,7 @@
           <w:szCs w:val="24"/>
           <w:rtl/>
         </w:rPr>
-        <w:t xml:space="preserve">נועה אמרה: "חמותי לוקחת אותם שלוש פעמים בשבוע. בלעדיה לא הייתי סטודנטית, פשוט לא", ומיד הוסיפה: "אני מרגישה שאני חייבת לה. היא אף פעם לא אמרה מילה, זה אני." התמיכה מתוארת כהלוואה: היא מאפשרת את הלימודים ובו בזמן פותחת חשבון רגשי שאינו נסגר. טלי, אם חד הורית, תיארה מציאות אחרת: "אין לי גב. יש לי שכנה טובה ותשלום לבייביסיטר, וזה מה יש." בהיעדר משפחה מורחבת זמינה התמיכה הופכת למוצר שנרכש, ועלותה מוטלת על מי שהכנסתה ממילא נמוכה.</w:t>
+        <w:t xml:space="preserve">נועה אמרה: "חמותי לוקחת אותם שלוש פעמים בשבוע. בלעדיה לא הייתי סטודנטית, פשוט לא", ומיד הוסיפה: "אני מרגישה שאני חייבת לה. היא אף פעם לא אמרה מילה, זה אני." התמיכה מתוארת כהלוואה: היא מאפשרת את הלימודים ובו בזמן פותחת חשבון רגשי שאינו נסגר. טלי, אם חד הורית, תיארה מציאות אחרת: "אין לי גב. יש לי שכנה טובה ותשלום לבייביסיטר, וזה מה יש." בהיעדר משפחה מורחבת זמינה התמיכה הופכת למוצר שנרכש, ועלותה מוטלת על מי שהכנסתה ממילא נמוכה. אנדרדה ואחרים מצאו שהאסטרטגיות שמפתחים הורים לומדים שלובות בתמיכה החברתית שהם מצליחים לגייס, ולא רק במידת הנחישות שלהם (Andrade et al., 2024).</w:t>
       </w:r>
     </w:p>
     <w:p>
@@ -1690,7 +1690,7 @@
           <w:szCs w:val="24"/>
           <w:rtl/>
         </w:rPr>
-        <w:t xml:space="preserve">שלוש האמירות מצביעות על אותו מנגנון: ההתאמות קיימות, אך הן ניתנות כטובה אישית ולא כזכות. לכן אינן ניתנות לתכנון ולא לתביעה, ומחייבות את הסטודנטית להציג את עצמה שוב ושוב כמקרה חריג הראוי לחמלה. הממצא תואם את מסקנתן של מורו וקרנר, שלפיה סטודנטים הורים נותרים בלתי נראים במדיניות המוסדית גם כשהם נראים היטב לעיני מרצה בודד (Moreau &amp; Kerner, 2015). מכאן מתחדדת השאלה מדוע בכל זאת ממשיכות המרואיינות ללמוד.</w:t>
+        <w:t xml:space="preserve">שלוש האמירות מצביעות על אותו מנגנון: ההתאמות קיימות, אך הן ניתנות כטובה אישית ולא כזכות. לכן אינן ניתנות לתכנון ולא לתביעה, ומחייבות את הסטודנטית להציג את עצמה שוב ושוב כמקרה חריג הראוי לחמלה. הממצא תואם את מסקנתם של סאלי ואחרים, שלפיה הצלחתן של אימהות סטודנטיות נשענת על גורם מוסדי בודד שנקרה בדרכן ולא על מדיניות סדורה, ולכן היא מקרית מטבעה (Sallee et al., 2025). מכאן מתחדדת השאלה מדוע בכל זאת ממשיכות המרואיינות ללמוד.</w:t>
       </w:r>
     </w:p>
     <w:p>
@@ -1807,7 +1807,7 @@
           <w:szCs w:val="24"/>
           <w:rtl/>
         </w:rPr>
-        <w:t xml:space="preserve">הממצאים מלמדים ששאלת השילוב אינה שאלה של ניהול זמן. שלוש המרואיינות מנהלות את זמנן היטב, ובכל זאת מתארות מחסור קבוע. גרינהאוס וביוטל הבחינו בין קונפליקט מבוסס זמן, קונפליקט מבוסס מאמץ וקונפליקט מבוסס התנהגות (Greenhaus &amp; Beutell, 1985). כאן בולטים שני הסוגים הראשונים ומופיעים יחד: הזמן חסר, וגם כשהוא נמצא, המשאב הנפשי שנדרש כדי להשתמש בו כבר הוצא במקום אחר. תיאורה של טלי, הפותחת מחשב בעשר וחצי בלילה, ממחיש שהקצאת שעה אינה שקולה להקצאת יכולת ללמוד בה.</w:t>
+        <w:t xml:space="preserve">הממצאים מלמדים ששאלת השילוב אינה שאלה של ניהול זמן. שלוש המרואיינות מנהלות את זמנן היטב, ובכל זאת מתארות מחסור קבוע. גרינהאוס וביוטל הבחינו בין קונפליקט מבוסס זמן, קונפליקט מבוסס מאמץ וקונפליקט מבוסס התנהגות (Greenhaus &amp; Beutell, 1985). כאן בולטים שני הסוגים הראשונים ומופיעים יחד: הזמן חסר, וגם כשהוא נמצא, המשאב הנפשי שנדרש כדי להשתמש בו כבר הוצא במקום אחר. תיאורה של טלי, הפותחת מחשב בעשר וחצי בלילה, ממחיש שהקצאת שעה אינה שקולה להקצאת יכולת ללמוד בה. ממצאיה של קוליק, שלפיהם נשים דיווחו על קונפליקט גבוה במיוחד במפגש שבין המשפחה ללימודים, מקבלים כאן פנים קונקרטיות (Kulik, 2025).</w:t>
       </w:r>
     </w:p>
     <w:p>
@@ -1839,23 +1839,23 @@
           <w:szCs w:val="24"/>
           <w:rtl/>
         </w:rPr>
-        <w:t xml:space="preserve">הממצא על ההתאמות הניתנות כטובה אישית מתכתב עם מורו וקרנר, שמצאו שהורות נעדרת מן ההגדרה המוסדית של הסטודנט, ולכן כל התאמה נתפסת כחריגה מן הכלל ולא כיישום שלו (Moreau &amp; Kerner, 2015). התאמה שאינה כתובה אינה ניתנת לתכנון, וסטודנטית שנאלצת לבקש אותה מחדש מכל מרצה משלמת מחיר נוסף בזמן ובכבוד.</w:t>
-      </w:r>
-    </w:p>
-    <w:p>
-      <w:pPr>
-        <w:bidi/>
-        <w:spacing w:after="0" w:line="480" w:lineRule="auto"/>
-        <w:jc w:val="both"/>
-      </w:pPr>
-      <w:r>
-        <w:rPr>
-          <w:rFonts w:ascii="David" w:cs="David" w:eastAsia="David" w:hAnsi="David"/>
-          <w:sz w:val="24"/>
-          <w:szCs w:val="24"/>
-          <w:rtl/>
-        </w:rPr>
-        <w:t xml:space="preserve">התימה החמישית מסייגת את התמונה. ברוקס מצאה בהשוואה בין מדינות שסטודנטים הורים מתארים את לימודיהם לא רק כמאמץ נוסף אלא כעבודת זהות (Brooks, 2012), ודבריה של טלי על התואר כדבר היחיד ששייך לה בלבד תואמים זאת. מכאן שמסגור השילוב כבעיה בלבד מחמיץ חלק מהותי מן החוויה, ומדיניות שתבקש להקל באמצעות צמצום דרישות עלולה לפגוע דווקא במה שמחזיק אותן.</w:t>
+        <w:t xml:space="preserve">הממצא על ההתאמות הניתנות כטובה אישית מתכתב עם סאלי ואחרים, שהראו שאימהות סטודנטיות נעות בין מוסדות שבהם קיים מערך שירותים שלם לבין מוסדות שבהם אין דבר, ושבתווך ניצב לרוב אדם אחד שהחליט לעזור (Sallee et al., 2025). התאמה שאינה כתובה אינה ניתנת לתכנון, וסטודנטית שנאלצת לבקש אותה מחדש מכל מרצה משלמת מחיר נוסף בזמן ובכבוד.</w:t>
+      </w:r>
+    </w:p>
+    <w:p>
+      <w:pPr>
+        <w:bidi/>
+        <w:spacing w:after="0" w:line="480" w:lineRule="auto"/>
+        <w:jc w:val="both"/>
+      </w:pPr>
+      <w:r>
+        <w:rPr>
+          <w:rFonts w:ascii="David" w:cs="David" w:eastAsia="David" w:hAnsi="David"/>
+          <w:sz w:val="24"/>
+          <w:szCs w:val="24"/>
+          <w:rtl/>
+        </w:rPr>
+        <w:t xml:space="preserve">התימה החמישית מסייגת את התמונה. לצד קונפליקט תפקידים בחנה קוליק גם העשרת תפקידים, כלומר תרומה חיובית של תפקיד אחד למשנהו, והראתה ששני התהליכים מתקיימים אצל אותם הורים בעת ובעונה אחת (Kulik, 2025). דבריה של טלי על התואר כדבר היחיד ששייך לה בלבד מצביעים על העשרה כזאת. מכאן שמסגור השילוב כבעיה בלבד מחמיץ חלק מהותי מן החוויה, ומדיניות שתבקש להקל באמצעות צמצום דרישות עלולה לפגוע דווקא במה שמחזיק אותן.</w:t>
       </w:r>
     </w:p>
     <w:p>
@@ -1905,23 +1905,23 @@
           <w:szCs w:val="24"/>
           <w:rtl/>
         </w:rPr>
-        <w:t xml:space="preserve">בחירת הנושא לא הייתה ניטרלית, והיא נבחרה מתוך קרבה. ההתלבטות הראשונה נגעה לשאלה אם קרבה כזאת פוסלת, והספרות המתודולוגית מציעה תשובה אחרת: הרפלקסיביות אינה ניסיון לנטרל את החוקרת אלא הכרה בכך שהיא חלק מן הידע שנוצר (Finlay, 2002). לכן נכתב לפני הראיונות מסמך קצר של הנחות מוקדמות, ובו ההנחה שהמרואיינות יתארו בעיקר עומס ותסכול. ההנחה התבררה כחלקית, והתימה החמישית עלתה מן החומר בניגוד לצפוי.</w:t>
-      </w:r>
-    </w:p>
-    <w:p>
-      <w:pPr>
-        <w:bidi/>
-        <w:spacing w:after="0" w:line="480" w:lineRule="auto"/>
-        <w:jc w:val="both"/>
-      </w:pPr>
-      <w:r>
-        <w:rPr>
-          <w:rFonts w:ascii="David" w:cs="David" w:eastAsia="David" w:hAnsi="David"/>
-          <w:sz w:val="24"/>
-          <w:szCs w:val="24"/>
-          <w:rtl/>
-        </w:rPr>
-        <w:t xml:space="preserve">הראיון הראשון נוהל בצורה מגושמת, עם רשימת שאלות ועם נטייה למלא כל שתיקה. סיידמן מדגיש שהמראיין נדרש לדבר פחות ולהקשיב יותר, ושהשתיקה היא כלי ולא כישלון (Seidman, 2013). בראיונות הבאים נעשה מאמץ מודע לספור שלוש שניות לפני כל תגובה, והמרואיינות המשיכו לדבר בעצמן והגיעו לחומר שלא נשאלו עליו. ההבדל ניכר באורך התשובות.</w:t>
+        <w:t xml:space="preserve">בחירת הנושא לא הייתה ניטרלית, והיא נבחרה מתוך קרבה. ההתלבטות הראשונה נגעה לשאלה אם קרבה כזאת פוסלת, והספרות המתודולוגית מציעה תשובה אחרת: הרפלקסיביות אינה ניסיון לנטרל את החוקרת אלא סדרה של פרקטיקות מתמשכות שבהן היא בוחנת כיצד הסובייקטיביות שלה מעצבת את המחקר (Olmos-Vega et al., 2023). לכן נכתב לפני הראיונות מסמך קצר של הנחות מוקדמות, ובו ההנחה שהמרואיינות יתארו בעיקר עומס ותסכול. ההנחה התבררה כחלקית, והתימה החמישית עלתה מן החומר בניגוד לצפוי.</w:t>
+      </w:r>
+    </w:p>
+    <w:p>
+      <w:pPr>
+        <w:bidi/>
+        <w:spacing w:after="0" w:line="480" w:lineRule="auto"/>
+        <w:jc w:val="both"/>
+      </w:pPr>
+      <w:r>
+        <w:rPr>
+          <w:rFonts w:ascii="David" w:cs="David" w:eastAsia="David" w:hAnsi="David"/>
+          <w:sz w:val="24"/>
+          <w:szCs w:val="24"/>
+          <w:rtl/>
+        </w:rPr>
+        <w:t xml:space="preserve">הראיון הראשון נוהל בצורה מגושמת, עם רשימת שאלות ועם נטייה למלא כל שתיקה. בספרות על הראיון האיכותני מודגש שהמראיין נדרש לדבר פחות ולהקשיב יותר, ושהשתיקה היא כלי ולא כישלון (שקדי, 2003). בראיונות הבאים נעשה מאמץ מודע לספור שלוש שניות לפני כל תגובה, והמרואיינות המשיכו לדבר בעצמן והגיעו לחומר שלא נשאלו עליו. ההבדל ניכר באורך התשובות.</w:t>
       </w:r>
     </w:p>
     <w:p>
@@ -1969,7 +1969,7 @@
           <w:szCs w:val="24"/>
           <w:rtl/>
         </w:rPr>
-        <w:t xml:space="preserve">הלמידה המרכזית מן התהליך היא שניתוח איכותני אינו איסוף ציטוטים אלא הכרעות. כל קוד הוא בחירה, כל שם של תימה הוא פרשנות, והשקיפות לגבי ההכרעות האלה היא מה שמבדיל בין ניתוח לבין רושם אישי (שקדי, 2003; Braun &amp; Clarke, 2006).</w:t>
+        <w:t xml:space="preserve">הלמידה המרכזית מן התהליך היא שניתוח איכותני אינו איסוף ציטוטים אלא הכרעות. כל קוד הוא בחירה, כל שם של תימה הוא פרשנות, והשקיפות לגבי ההכרעות האלה היא מה שמבדיל בין ניתוח לבין רושם אישי (שקדי, 2003; Braun &amp; Clarke, 2022).</w:t>
       </w:r>
     </w:p>
     <w:p>
@@ -2089,7 +2089,7 @@
           <w:szCs w:val="24"/>
           <w:rtl/>
         </w:rPr>
-        <w:t xml:space="preserve">פוגל-ביז'אוי, ס' (1999). משפחות בישראל: בין משפחתיות לפוסטמודרניות. בתוך ד' יזרעאלי, א' פרידמן, ה' דהאן-כלב, ח' הרצוג, מ' חסן, ח' נוה וס' פוגל-ביז'אוי, מין, מגדר, פוליטיקה (עמ' 107-166). הקיבוץ המאוחד.</w:t>
+        <w:t xml:space="preserve">צבר בן-יהושע, נ' (עורכת). (2016). מסורות וזרמים במחקר האיכותני: תפיסות, אסטרטגיות וכלים מתקדמים. מכון מופ"ת.</w:t>
       </w:r>
     </w:p>
     <w:p>
@@ -2106,40 +2106,6 @@
           <w:szCs w:val="24"/>
           <w:rtl/>
         </w:rPr>
-        <w:t xml:space="preserve">צבר בן-יהושע, נ' (עורכת). (2016). מסורות וזרמים במחקר האיכותני: תפיסות, אסטרטגיות וכלים מתקדמים. מכון מופ"ת.</w:t>
-      </w:r>
-    </w:p>
-    <w:p>
-      <w:pPr>
-        <w:bidi/>
-        <w:spacing w:after="0" w:line="480" w:lineRule="auto"/>
-        <w:ind w:start="709" w:hanging="709"/>
-        <w:jc w:val="right"/>
-      </w:pPr>
-      <w:r>
-        <w:rPr>
-          <w:rFonts w:ascii="David" w:cs="David" w:eastAsia="David" w:hAnsi="David"/>
-          <w:sz w:val="24"/>
-          <w:szCs w:val="24"/>
-          <w:rtl/>
-        </w:rPr>
-        <w:t xml:space="preserve">שלסקי, ש', ואלפרט, ב' (2007). דרכים בכתיבת מחקר איכותני: מפירוק המציאות להבנייתה כטקסט. מכון מופ"ת.</w:t>
-      </w:r>
-    </w:p>
-    <w:p>
-      <w:pPr>
-        <w:bidi/>
-        <w:spacing w:after="0" w:line="480" w:lineRule="auto"/>
-        <w:ind w:start="709" w:hanging="709"/>
-        <w:jc w:val="right"/>
-      </w:pPr>
-      <w:r>
-        <w:rPr>
-          <w:rFonts w:ascii="David" w:cs="David" w:eastAsia="David" w:hAnsi="David"/>
-          <w:sz w:val="24"/>
-          <w:szCs w:val="24"/>
-          <w:rtl/>
-        </w:rPr>
         <w:t xml:space="preserve">שקדי, א' (2003). מילים המנסות לגעת: מחקר איכותני, תיאוריה ויישום. רמות.</w:t>
       </w:r>
     </w:p>
@@ -2156,7 +2122,7 @@
           <w:sz w:val="24"/>
           <w:szCs w:val="24"/>
         </w:rPr>
-        <w:t xml:space="preserve">Braun, V., &amp; Clarke, V. (2006). Using thematic analysis in psychology. Qualitative Research in Psychology, 3(2), 77-101. https://doi.org/10.1191/1478088706qp063oa</w:t>
+        <w:t xml:space="preserve">Andrade, C., Fernandes, J. L., &amp; Almeida, L. S. (2024). Mature working student parents navigating multiple roles: A qualitative analysis. Education Sciences, 14(7), Article 786. https://doi.org/10.3390/educsci14070786</w:t>
       </w:r>
     </w:p>
     <w:p>
@@ -2172,7 +2138,7 @@
           <w:sz w:val="24"/>
           <w:szCs w:val="24"/>
         </w:rPr>
-        <w:t xml:space="preserve">Brooks, R. (2012). Student-parents and higher education: A cross-national comparison. Journal of Education Policy, 27(3), 423-439. https://doi.org/10.1080/02680939.2011.613598</w:t>
+        <w:t xml:space="preserve">Braun, V., &amp; Clarke, V. (2022). Thematic analysis: A practical guide. Sage.</w:t>
       </w:r>
     </w:p>
     <w:p>
@@ -2188,7 +2154,7 @@
           <w:sz w:val="24"/>
           <w:szCs w:val="24"/>
         </w:rPr>
-        <w:t xml:space="preserve">Finlay, L. (2002). "Outing" the researcher: The provenance, process, and practice of reflexivity. Qualitative Health Research, 12(4), 531-545. https://doi.org/10.1177/104973202129120052</w:t>
+        <w:t xml:space="preserve">Greenhaus, J. H., &amp; Beutell, N. J. (1985). Sources of conflict between work and family roles. Academy of Management Review, 10(1), 76-88. https://doi.org/10.2307/258214</w:t>
       </w:r>
     </w:p>
     <w:p>
@@ -2204,7 +2170,7 @@
           <w:sz w:val="24"/>
           <w:szCs w:val="24"/>
         </w:rPr>
-        <w:t xml:space="preserve">Greenhaus, J. H., &amp; Beutell, N. J. (1985). Sources of conflict between work and family roles. Academy of Management Review, 10(1), 76-88. https://doi.org/10.2307/258214</w:t>
+        <w:t xml:space="preserve">Guillemin, M., &amp; Gillam, L. (2004). Ethics, reflexivity, and "ethically important moments" in research. Qualitative Inquiry, 10(2), 261-280. https://doi.org/10.1177/1077800403262360</w:t>
       </w:r>
     </w:p>
     <w:p>
@@ -2220,7 +2186,7 @@
           <w:sz w:val="24"/>
           <w:szCs w:val="24"/>
         </w:rPr>
-        <w:t xml:space="preserve">Guillemin, M., &amp; Gillam, L. (2004). Ethics, reflexivity, and "ethically important moments" in research. Qualitative Inquiry, 10(2), 261-280. https://doi.org/10.1177/1077800403262360</w:t>
+        <w:t xml:space="preserve">Hays, S. (1996). The cultural contradictions of motherhood. Yale University Press.</w:t>
       </w:r>
     </w:p>
     <w:p>
@@ -2236,7 +2202,7 @@
           <w:sz w:val="24"/>
           <w:szCs w:val="24"/>
         </w:rPr>
-        <w:t xml:space="preserve">Hays, S. (1996). The cultural contradictions of motherhood. Yale University Press.</w:t>
+        <w:t xml:space="preserve">Hochschild, A. R. (1989). The second shift: Working parents and the revolution at home. Viking.</w:t>
       </w:r>
     </w:p>
     <w:p>
@@ -2252,7 +2218,7 @@
           <w:sz w:val="24"/>
           <w:szCs w:val="24"/>
         </w:rPr>
-        <w:t xml:space="preserve">Hochschild, A. R. (1989). The second shift: Working parents and the revolution at home. Viking.</w:t>
+        <w:t xml:space="preserve">Kulik, L. (2025). Working and studying Israeli parents: Experiences in multiple role interfaces. International Journal for the Advancement of Counselling, 47, 625-650. https://doi.org/10.1007/s10447-025-09605-3</w:t>
       </w:r>
     </w:p>
     <w:p>
@@ -2268,7 +2234,7 @@
           <w:sz w:val="24"/>
           <w:szCs w:val="24"/>
         </w:rPr>
-        <w:t xml:space="preserve">Kvale, S., &amp; Brinkmann, S. (2009). InterViews: Learning the craft of qualitative research interviewing (2nd ed.). Sage.</w:t>
+        <w:t xml:space="preserve">Olmos-Vega, F. M., Stalmeijer, R. E., Varpio, L., &amp; Kahlke, R. (2023). A practical guide to reflexivity in qualitative research: AMEE Guide No. 149. Medical Teacher, 45(3), 241-251. https://doi.org/10.1080/0142159X.2022.2057287</w:t>
       </w:r>
     </w:p>
     <w:p>
@@ -2284,87 +2250,7 @@
           <w:sz w:val="24"/>
           <w:szCs w:val="24"/>
         </w:rPr>
-        <w:t xml:space="preserve">Lincoln, Y. S., &amp; Guba, E. G. (1985). Naturalistic inquiry. Sage.</w:t>
-      </w:r>
-    </w:p>
-    <w:p>
-      <w:pPr>
-        <w:bidi w:val="false"/>
-        <w:spacing w:after="0" w:line="480" w:lineRule="auto"/>
-        <w:ind w:left="709" w:hanging="709"/>
-        <w:jc w:val="left"/>
-      </w:pPr>
-      <w:r>
-        <w:rPr>
-          <w:rFonts w:ascii="Times New Roman" w:cs="Times New Roman" w:eastAsia="Times New Roman" w:hAnsi="Times New Roman"/>
-          <w:sz w:val="24"/>
-          <w:szCs w:val="24"/>
-        </w:rPr>
-        <w:t xml:space="preserve">Moreau, M.-P., &amp; Kerner, C. (2015). Care in academia: An exploration of student parents' experiences. British Journal of Sociology of Education, 36(2), 215-233. https://doi.org/10.1080/01425692.2013.814533</w:t>
-      </w:r>
-    </w:p>
-    <w:p>
-      <w:pPr>
-        <w:bidi w:val="false"/>
-        <w:spacing w:after="0" w:line="480" w:lineRule="auto"/>
-        <w:ind w:left="709" w:hanging="709"/>
-        <w:jc w:val="left"/>
-      </w:pPr>
-      <w:r>
-        <w:rPr>
-          <w:rFonts w:ascii="Times New Roman" w:cs="Times New Roman" w:eastAsia="Times New Roman" w:hAnsi="Times New Roman"/>
-          <w:sz w:val="24"/>
-          <w:szCs w:val="24"/>
-        </w:rPr>
-        <w:t xml:space="preserve">Oakley, A. (1981). Interviewing women: A contradiction in terms. In H. Roberts (Ed.), Doing feminist research (pp. 30-61). Routledge &amp; Kegan Paul.</w:t>
-      </w:r>
-    </w:p>
-    <w:p>
-      <w:pPr>
-        <w:bidi w:val="false"/>
-        <w:spacing w:after="0" w:line="480" w:lineRule="auto"/>
-        <w:ind w:left="709" w:hanging="709"/>
-        <w:jc w:val="left"/>
-      </w:pPr>
-      <w:r>
-        <w:rPr>
-          <w:rFonts w:ascii="Times New Roman" w:cs="Times New Roman" w:eastAsia="Times New Roman" w:hAnsi="Times New Roman"/>
-          <w:sz w:val="24"/>
-          <w:szCs w:val="24"/>
-        </w:rPr>
-        <w:t xml:space="preserve">Patton, M. Q. (2015). Qualitative research and evaluation methods: Integrating theory and practice (4th ed.). Sage.</w:t>
-      </w:r>
-    </w:p>
-    <w:p>
-      <w:pPr>
-        <w:bidi w:val="false"/>
-        <w:spacing w:after="0" w:line="480" w:lineRule="auto"/>
-        <w:ind w:left="709" w:hanging="709"/>
-        <w:jc w:val="left"/>
-      </w:pPr>
-      <w:r>
-        <w:rPr>
-          <w:rFonts w:ascii="Times New Roman" w:cs="Times New Roman" w:eastAsia="Times New Roman" w:hAnsi="Times New Roman"/>
-          <w:sz w:val="24"/>
-          <w:szCs w:val="24"/>
-        </w:rPr>
-        <w:t xml:space="preserve">Seidman, I. (2013). Interviewing as qualitative research: A guide for researchers in education and the social sciences (4th ed.). Teachers College Press.</w:t>
-      </w:r>
-    </w:p>
-    <w:p>
-      <w:pPr>
-        <w:bidi w:val="false"/>
-        <w:spacing w:after="0" w:line="480" w:lineRule="auto"/>
-        <w:ind w:left="709" w:hanging="709"/>
-        <w:jc w:val="left"/>
-      </w:pPr>
-      <w:r>
-        <w:rPr>
-          <w:rFonts w:ascii="Times New Roman" w:cs="Times New Roman" w:eastAsia="Times New Roman" w:hAnsi="Times New Roman"/>
-          <w:sz w:val="24"/>
-          <w:szCs w:val="24"/>
-        </w:rPr>
-        <w:t xml:space="preserve">Stier, H., Lewin-Epstein, N., &amp; Braun, M. (2001). Welfare regimes, family-supportive policies, and women's employment along the life-course. American Journal of Sociology, 106(6), 1731-1760. https://doi.org/10.1086/321302</w:t>
+        <w:t xml:space="preserve">Sallee, M. W., Lewis, D. V., &amp; Collier, K. (2025). From comprehensive services to no support at all: How institutional agents shape student-mothers' academic success. The Journal of Higher Education, 96(1), 1-27. https://doi.org/10.1080/00221546.2023.2282376</w:t>
       </w:r>
     </w:p>
     <w:p>

</xml_diff>

<commit_message>
Name the interview genre as a depth interview, matching the course guidelines
The assignment repeatedly specifies ראיונות עומק, so the methodology
chapter now leads with that term and explains its two-stage structure
(broad opening question, then clarification and expansion questions
driven by what the interviewee raised) instead of labelling the tool a
semi-structured interview. The interview guide appendix notes the same
logic.

Co-Authored-By: Claude Opus 5 <noreply@anthropic.com>
Claude-Session: https://claude.ai/code/session_01EG6i6REnRBMzUsj4m2kHAL
</commit_message>
<xml_diff>
--- a/docs/עבודה מסכמת - חווייתן של אימהות צעירות בשילוב בין לימודים עבודה וחיי משפחה.docx
+++ b/docs/עבודה מסכמת - חווייתן של אימהות צעירות בשילוב בין לימודים עבודה וחיי משפחה.docx
@@ -400,7 +400,7 @@
           <w:szCs w:val="24"/>
           <w:rtl/>
         </w:rPr>
-        <w:t xml:space="preserve">העבודה נערכה בגישה איכותנית-פרשנית, המניחה שהמציאות החברתית נבנית על ידי המשתתפים בה ושהדרך להגיע אליה עוברת דרך המילים שהם עצמם בוחרים לתאר אותה (שקדי, 2003). מכיוון שהשאלה כאן אינה כמה שעות עובדת אם צעירה אלא כיצד היא מבינה את חייה, שיטה שמודדת שכיחויות אינה מתאימה. הסוגה שנבחרה קרובה לגישה הפנומנולוגית, המתמקדת בחוויה החיה כפי שהיא נחווית מבפנים ומבקשת לתאר את מבנה המשמעות שלה ולא את סיבותיה (צבר בן-יהושע, 2016). כלי המחקר הוא ראיון עומק חצי מובנה, המאפשר למרואיינת להוביל את השיחה ובה בעת שומר בידי המראיינת רשימת תחומים לכיסוי. זהו הכלי שבו נעשה שימוש גם במחקרים עדכניים על הורים שלומדים ועובדים בו זמנית (Andrade et al., 2024). מדריך הראיון מופיע בנספח 1.</w:t>
+        <w:t xml:space="preserve">העבודה נערכה בגישה איכותנית-פרשנית, המניחה שהמציאות החברתית נבנית על ידי המשתתפים בה ושהדרך להגיע אליה עוברת דרך המילים שהם עצמם בוחרים לתאר אותה (שקדי, 2003). מכיוון שהשאלה כאן אינה כמה שעות עובדת אם צעירה אלא כיצד היא מבינה את חייה, שיטה שמודדת שכיחויות אינה מתאימה. הסוגה שנבחרה קרובה לגישה הפנומנולוגית, המתמקדת בחוויה החיה כפי שהיא נחווית מבפנים ומבקשת לתאר את מבנה המשמעות שלה ולא את סיבותיה (צבר בן-יהושע, 2016). כלי המחקר הוא ראיון עומק. בניגוד לראיון מובנה, שבו כל המרואיינות נשאלות אותן שאלות באותו סדר, ראיון עומק מתנהל בשני שלבים: תחילה שאלת פתיחה רחבה שמותירה למרואיינת לבחור כיצד לספר את הדברים ובאיזה סדר, ורק לאחר מכן שאלות הבהרה והרחבה שנגזרות ממה שהיא עצמה העלתה. המראיינת מגיעה עם מדריך ראיון, אך זהו רשימת תחומים שהיא מבקשת ללמוד עליהם ולא שאלון, והיא פונה אליו לפי הצורך. מבנה כזה מתאים לשאלת המחקר משום שהוא מאפשר למשמעויות לעלות מלשון המרואיינת ולא ממושגים שהמראיינת הביאה עמה (שקדי, 2003). מחקרים עדכניים על הורים שלומדים ועובדים בו זמנית נעזרו באותה סוגה (Andrade et al., 2024). מדריך הראיון מופיע בנספח 1.</w:t>
       </w:r>
     </w:p>
     <w:p>
@@ -2287,7 +2287,7 @@
           <w:szCs w:val="24"/>
           <w:rtl/>
         </w:rPr>
-        <w:t xml:space="preserve">מדריך זה שימש כרשימת תחומים ולא כשאלון. סדר השאלות השתנה בכל ראיון בהתאם למה שהעלתה המרואיינת, וחלק מן השאלות לא נשאלו כלל כשהנושא כוסה מעצמו.</w:t>
+        <w:t xml:space="preserve">מדריך זה שימש כרשימת תחומים ולא כשאלון, בהתאם לאופיו של ראיון עומק. סדר השאלות השתנה בכל ראיון בהתאם למה שהעלתה המרואיינת, חלק מן השאלות לא נשאלו כלל כשהנושא כוסה מעצמו, ושאלות אחרות צצו במהלך הראיון ולא תוכננו מראש.</w:t>
       </w:r>
     </w:p>
     <w:p>

</xml_diff>